<commit_message>
docs: make 3 Multimodal the primary module and record published evidence crops
No agent was built, so Agents is no longer listed as primary. Storage, Space screen,
risk and diagram text now describe the evidence and PPE-review crops added in #3.

Co-authored-by: Cursor <cursoragent@cursor.com>
</commit_message>
<xml_diff>
--- a/CS3235_Project_Requirements_Filled.docx
+++ b/CS3235_Project_Requirements_Filled.docx
@@ -436,7 +436,7 @@
                 <w:sz w:val="19"/>
                 <w:szCs w:val="19"/>
               </w:rPr>
-              <w:t xml:space="preserve">2 Agents (primary). Also draws on 1 LLM foundations, 3 Multimodal, and 5 Advanced apps &amp; benchmarking.</w:t>
+              <w:t xml:space="preserve">3 Multimodal (primary): Gemini vision reviews worker crops and proposes zones from keyframes. Also draws on 5 Advanced apps &amp; benchmarking and 1 LLM foundations.</w:t>
             </w:r>
           </w:p>
         </w:tc>
@@ -5183,7 +5183,7 @@
         <w:t xml:space="preserve">Personal or sensitive data — </w:t>
       </w:r>
       <w:r>
-        <w:t xml:space="preserve">no accounts exist, so no names or emails are stored. The database holds incident records, briefings and Q&amp;A history; Storage holds the twin video and HTML report. Crops and keyframes sent to the free Gemini tier may be used by Google to improve its products.</w:t>
+        <w:t xml:space="preserve">no accounts exist, so no names or emails are stored. The database holds incident records, briefings and Q&amp;A history; Storage holds the twin video, HTML report, evidence crops and reviewed PPE crops. Crops and keyframes sent to the free Gemini tier may be used by Google to improve its products.</w:t>
       </w:r>
     </w:p>
     <w:p>
@@ -9264,7 +9264,7 @@
                 <w:sz w:val="19"/>
                 <w:szCs w:val="19"/>
               </w:rPr>
-              <w:t xml:space="preserve">Drop zone, twin video, incident list, HTML report link, Publish to Space button.</w:t>
+              <w:t xml:space="preserve">Drop zone, twin video, incident list with evidence crops, HTML report link, Publish to Space button.</w:t>
             </w:r>
           </w:p>
         </w:tc>
@@ -9510,7 +9510,7 @@
                 <w:sz w:val="19"/>
                 <w:szCs w:val="19"/>
               </w:rPr>
-              <w:t xml:space="preserve">Signed-URL video player, run summary with rule coverage, grounded briefings with clause citations.</w:t>
+              <w:t xml:space="preserve">Signed-URL video player, run summary with rule coverage, incident cards with evidence crops, reviewed-crop grid (classifier vs Gemini), cited briefings.</w:t>
             </w:r>
           </w:p>
         </w:tc>
@@ -11651,7 +11651,7 @@
         <w:t xml:space="preserve">Supabase — </w:t>
       </w:r>
       <w:r>
-        <w:t xml:space="preserve">Postgres holds runs, incidents, briefings and the law corpus with its vectors; Storage holds the twin video and HTML report in a private bucket.</w:t>
+        <w:t xml:space="preserve">Postgres holds runs, incidents, briefings and the law corpus with its vectors; Storage holds the twin video, HTML report, evidence and PPE-review crops and a media index in a private bucket.</w:t>
       </w:r>
     </w:p>
     <w:p>
@@ -11671,7 +11671,7 @@
         <w:t xml:space="preserve">Signed URLs — </w:t>
       </w:r>
       <w:r>
-        <w:t xml:space="preserve">the Space asks Storage for a 1-hour link per view, and the browser streams the video from Supabase directly.</w:t>
+        <w:t xml:space="preserve">the Space asks Storage for 1-hour links per view, and the browser streams the video and loads the crops from Supabase directly.</w:t>
       </w:r>
     </w:p>
     <w:p>
@@ -13269,7 +13269,7 @@
                 <w:sz w:val="19"/>
                 <w:szCs w:val="19"/>
               </w:rPr>
-              <w:t xml:space="preserve">Only the twin video and HTML report are uploaded per run; old runs' media can be deleted from the bucket while their incident rows are kept.</w:t>
+              <w:t xml:space="preserve">Per run only the video, report, one crop per incident and at most 48 reviewed crops are uploaded; old runs' media can be deleted while incident rows stay.</w:t>
             </w:r>
           </w:p>
         </w:tc>
@@ -14888,7 +14888,7 @@
                 <w:sz w:val="19"/>
                 <w:szCs w:val="19"/>
               </w:rPr>
-              <w:t xml:space="preserve">As-built architecture: Gradio Space (no FastAPI, sign-in or Langfuse); fixed Q&amp;A pipeline instead of an agent; deterministic L2 briefings; MJCSD-trained YOLO11n; 27-clause corpus; measured detector and narration results.</w:t>
+              <w:t xml:space="preserve">As-built architecture: Gradio Space (no FastAPI, sign-in or Langfuse); fixed Q&amp;A pipeline instead of an agent; deterministic L2 briefings; MJCSD-trained YOLO11n; 27-clause corpus; measured detector and narration results; evidence and PPE-review crops published and shown; primary module set to 3 Multimodal.</w:t>
             </w:r>
           </w:p>
         </w:tc>

</xml_diff>